<commit_message>
Työaikaraportti – Odette, ajantasalla
</commit_message>
<xml_diff>
--- a/työnseuranta/Työaikaraportti – Odette (1).docx
+++ b/työnseuranta/Työaikaraportti – Odette (1).docx
@@ -1531,7 +1531,7 @@
       </w:tr>
       <w:tr>
         <w:trPr>
-          <w:trHeight w:val="240" w:hRule="auto"/>
+          <w:trHeight w:val="1" w:hRule="atLeast"/>
           <w:jc w:val="left"/>
         </w:trPr>
         <w:tc>
@@ -1614,7 +1614,7 @@
                 <w:sz w:val="22"/>
                 <w:shd w:fill="auto" w:val="clear"/>
               </w:rPr>
-              <w:t xml:space="preserve">1h</w:t>
+              <w:t xml:space="preserve">2h</w:t>
             </w:r>
           </w:p>
         </w:tc>
@@ -1656,7 +1656,7 @@
                 <w:sz w:val="22"/>
                 <w:shd w:fill="auto" w:val="clear"/>
               </w:rPr>
-              <w:t xml:space="preserve">Palaveri</w:t>
+              <w:t xml:space="preserve">Palaveri ja kokouksen muistiinpanon kirjoittaminen</w:t>
             </w:r>
           </w:p>
         </w:tc>
@@ -1704,7 +1704,7 @@
                 <w:sz w:val="22"/>
                 <w:shd w:fill="auto" w:val="clear"/>
               </w:rPr>
-              <w:t xml:space="preserve">07.10</w:t>
+              <w:t xml:space="preserve">13.10</w:t>
             </w:r>
           </w:p>
         </w:tc>
@@ -1746,7 +1746,7 @@
                 <w:sz w:val="22"/>
                 <w:shd w:fill="auto" w:val="clear"/>
               </w:rPr>
-              <w:t xml:space="preserve">1.30h</w:t>
+              <w:t xml:space="preserve">2h</w:t>
             </w:r>
           </w:p>
         </w:tc>
@@ -1788,7 +1788,7 @@
                 <w:sz w:val="22"/>
                 <w:shd w:fill="auto" w:val="clear"/>
               </w:rPr>
-              <w:t xml:space="preserve">Kokouksen muistiinpanon kirjoittaminen</w:t>
+              <w:t xml:space="preserve">Kokous ja muistiinpanon kirjoittaminen</w:t>
             </w:r>
           </w:p>
         </w:tc>
@@ -1825,9 +1825,19 @@
                 <w:spacing w:val="0"/>
                 <w:position w:val="0"/>
                 <w:sz w:val="22"/>
-                <w:shd w:fill="auto" w:val="clear"/>
-              </w:rPr>
-            </w:pPr>
+              </w:rPr>
+            </w:pPr>
+            <w:r>
+              <w:rPr>
+                <w:rFonts w:ascii="Calibri" w:hAnsi="Calibri" w:cs="Calibri" w:eastAsia="Calibri"/>
+                <w:color w:val="auto"/>
+                <w:spacing w:val="0"/>
+                <w:position w:val="0"/>
+                <w:sz w:val="22"/>
+                <w:shd w:fill="auto" w:val="clear"/>
+              </w:rPr>
+              <w:t xml:space="preserve">15.10</w:t>
+            </w:r>
           </w:p>
         </w:tc>
         <w:tc>
@@ -1857,9 +1867,19 @@
                 <w:spacing w:val="0"/>
                 <w:position w:val="0"/>
                 <w:sz w:val="22"/>
-                <w:shd w:fill="auto" w:val="clear"/>
-              </w:rPr>
-            </w:pPr>
+              </w:rPr>
+            </w:pPr>
+            <w:r>
+              <w:rPr>
+                <w:rFonts w:ascii="Calibri" w:hAnsi="Calibri" w:cs="Calibri" w:eastAsia="Calibri"/>
+                <w:color w:val="auto"/>
+                <w:spacing w:val="0"/>
+                <w:position w:val="0"/>
+                <w:sz w:val="22"/>
+                <w:shd w:fill="auto" w:val="clear"/>
+              </w:rPr>
+              <w:t xml:space="preserve">1.30h</w:t>
+            </w:r>
           </w:p>
         </w:tc>
         <w:tc>
@@ -1889,9 +1909,19 @@
                 <w:spacing w:val="0"/>
                 <w:position w:val="0"/>
                 <w:sz w:val="22"/>
-                <w:shd w:fill="auto" w:val="clear"/>
-              </w:rPr>
-            </w:pPr>
+              </w:rPr>
+            </w:pPr>
+            <w:r>
+              <w:rPr>
+                <w:rFonts w:ascii="Calibri" w:hAnsi="Calibri" w:cs="Calibri" w:eastAsia="Calibri"/>
+                <w:color w:val="auto"/>
+                <w:spacing w:val="0"/>
+                <w:position w:val="0"/>
+                <w:sz w:val="22"/>
+                <w:shd w:fill="auto" w:val="clear"/>
+              </w:rPr>
+              <w:t xml:space="preserve">Projektin viimeistely ja palauttaminen</w:t>
+            </w:r>
           </w:p>
         </w:tc>
       </w:tr>

</xml_diff>